<commit_message>
Hiển thị kết quả kiểm tra URL đồng bộ
Cập nhật dashboard hiển thị trạng thái, limitations, danh sách link và các trường DOM được phép; thêm bộ lọc visibility và element type. Làm rõ kết quả partial/failed, hỗ trợ kiểm thử API client và bổ sung test rendering.
</commit_message>
<xml_diff>
--- a/docs/prompt-history.docx
+++ b/docs/prompt-history.docx
@@ -72,15 +72,7 @@
         <w:spacing w:after="0" w:line="240" w:lineRule="auto"/>
       </w:pPr>
       <w:r>
-        <w:t xml:space="preserve">- Phạm </w:t>
-      </w:r>
-      <w:proofErr w:type="gramStart"/>
-      <w:r>
-        <w:t>vi</w:t>
-      </w:r>
-      <w:proofErr w:type="gramEnd"/>
-      <w:r>
-        <w:t xml:space="preserve"> sản phẩm và người dùng;</w:t>
+        <w:t>- Phạm vi sản phẩm và người dùng;</w:t>
       </w:r>
     </w:p>
     <w:p>
@@ -130,13 +122,8 @@
       <w:pPr>
         <w:spacing w:after="0" w:line="240" w:lineRule="auto"/>
       </w:pPr>
-      <w:proofErr w:type="gramStart"/>
-      <w:r>
-        <w:t>tạo</w:t>
-      </w:r>
-      <w:proofErr w:type="gramEnd"/>
-      <w:r>
-        <w:t xml:space="preserve"> hoặc cập nhật. Chưa sửa file cho tới khi tôi duyệt danh sách.</w:t>
+      <w:r>
+        <w:t>tạo hoặc cập nhật. Chưa sửa file cho tới khi tôi duyệt danh sách.</w:t>
       </w:r>
     </w:p>
     <w:p>
@@ -166,28 +153,15 @@
         <w:spacing w:after="0" w:line="240" w:lineRule="auto"/>
       </w:pPr>
       <w:r>
-        <w:t xml:space="preserve">Triển khai PostgreSQL persistence cho Hidden Link Checker </w:t>
-      </w:r>
-      <w:proofErr w:type="gramStart"/>
-      <w:r>
-        <w:t>theo</w:t>
-      </w:r>
-      <w:proofErr w:type="gramEnd"/>
-      <w:r>
-        <w:t xml:space="preserve"> quyết định</w:t>
-      </w:r>
-    </w:p>
-    <w:p>
-      <w:pPr>
-        <w:spacing w:after="0" w:line="240" w:lineRule="auto"/>
-      </w:pPr>
-      <w:proofErr w:type="gramStart"/>
-      <w:r>
-        <w:t>database-guide.md</w:t>
-      </w:r>
-      <w:proofErr w:type="gramEnd"/>
-      <w:r>
-        <w:t xml:space="preserve"> và domain/API contract đã duyệt.</w:t>
+        <w:t>Triển khai PostgreSQL persistence cho Hidden Link Checker theo quyết định</w:t>
+      </w:r>
+    </w:p>
+    <w:p>
+      <w:pPr>
+        <w:spacing w:after="0" w:line="240" w:lineRule="auto"/>
+      </w:pPr>
+      <w:r>
+        <w:t>database-guide.md và domain/API contract đã duyệt.</w:t>
       </w:r>
     </w:p>
     <w:p>
@@ -211,15 +185,7 @@
         <w:spacing w:after="0" w:line="240" w:lineRule="auto"/>
       </w:pPr>
       <w:r>
-        <w:t xml:space="preserve">- </w:t>
-      </w:r>
-      <w:proofErr w:type="gramStart"/>
-      <w:r>
-        <w:t>lưu</w:t>
-      </w:r>
-      <w:proofErr w:type="gramEnd"/>
-      <w:r>
-        <w:t xml:space="preserve"> user, scan và findings theo contract;</w:t>
+        <w:t>- lưu user, scan và findings theo contract;</w:t>
       </w:r>
     </w:p>
     <w:p>
@@ -235,47 +201,23 @@
         <w:spacing w:after="0" w:line="240" w:lineRule="auto"/>
       </w:pPr>
       <w:r>
-        <w:t xml:space="preserve">- </w:t>
-      </w:r>
-      <w:proofErr w:type="gramStart"/>
-      <w:r>
-        <w:t>transaction</w:t>
-      </w:r>
-      <w:proofErr w:type="gramEnd"/>
-      <w:r>
-        <w:t xml:space="preserve"> và unique/foreign-key constraints phù hợp;</w:t>
-      </w:r>
-    </w:p>
-    <w:p>
-      <w:pPr>
-        <w:spacing w:after="0" w:line="240" w:lineRule="auto"/>
-      </w:pPr>
-      <w:r>
-        <w:t xml:space="preserve">- </w:t>
-      </w:r>
-      <w:proofErr w:type="gramStart"/>
-      <w:r>
-        <w:t>secrets</w:t>
-      </w:r>
-      <w:proofErr w:type="gramEnd"/>
-      <w:r>
-        <w:t xml:space="preserve"> chỉ lấy từ environment/configuration, không commit credential;</w:t>
-      </w:r>
-    </w:p>
-    <w:p>
-      <w:pPr>
-        <w:spacing w:after="0" w:line="240" w:lineRule="auto"/>
-      </w:pPr>
-      <w:r>
-        <w:t xml:space="preserve">- </w:t>
-      </w:r>
-      <w:proofErr w:type="gramStart"/>
-      <w:r>
-        <w:t>không</w:t>
-      </w:r>
-      <w:proofErr w:type="gramEnd"/>
-      <w:r>
-        <w:t xml:space="preserve"> để browser worker truy cập database trực tiếp.</w:t>
+        <w:t>- transaction và unique/foreign-key constraints phù hợp;</w:t>
+      </w:r>
+    </w:p>
+    <w:p>
+      <w:pPr>
+        <w:spacing w:after="0" w:line="240" w:lineRule="auto"/>
+      </w:pPr>
+      <w:r>
+        <w:t>- secrets chỉ lấy từ environment/configuration, không commit credential;</w:t>
+      </w:r>
+    </w:p>
+    <w:p>
+      <w:pPr>
+        <w:spacing w:after="0" w:line="240" w:lineRule="auto"/>
+      </w:pPr>
+      <w:r>
+        <w:t>- không để browser worker truy cập database trực tiếp.</w:t>
       </w:r>
       <w:r>
         <w:br/>
@@ -289,13 +231,8 @@
       <w:pPr>
         <w:spacing w:after="0" w:line="240" w:lineRule="auto"/>
       </w:pPr>
-      <w:proofErr w:type="gramStart"/>
-      <w:r>
-        <w:t>test</w:t>
-      </w:r>
-      <w:proofErr w:type="gramEnd"/>
-      <w:r>
-        <w:t xml:space="preserve"> chạy trên PostgreSQL; Trước khi sửa, liệt kê file và migration dự kiến</w:t>
+      <w:r>
+        <w:t>test chạy trên PostgreSQL; Trước khi sửa, liệt kê file và migration dự kiến</w:t>
       </w:r>
     </w:p>
     <w:p>
@@ -330,66 +267,48 @@
         <w:spacing w:after="0" w:line="240" w:lineRule="auto"/>
       </w:pPr>
       <w:r>
-        <w:t xml:space="preserve">Hãy triển khai database PostgreSQL cho dự </w:t>
-      </w:r>
-      <w:proofErr w:type="gramStart"/>
-      <w:r>
-        <w:t>án</w:t>
-      </w:r>
-      <w:proofErr w:type="gramEnd"/>
-      <w:r>
-        <w:t xml:space="preserve"> Hidden Link Checker dựa trên tài liệu:</w:t>
-      </w:r>
-    </w:p>
-    <w:p>
-      <w:pPr>
-        <w:spacing w:after="0" w:line="240" w:lineRule="auto"/>
-      </w:pPr>
-      <w:proofErr w:type="gramStart"/>
+        <w:t>Hãy triển khai database PostgreSQL cho dự án Hidden Link Checker dựa trên tài liệu:</w:t>
+      </w:r>
+    </w:p>
+    <w:p>
+      <w:pPr>
+        <w:spacing w:after="0" w:line="240" w:lineRule="auto"/>
+      </w:pPr>
       <w:r>
         <w:t>docs/database-guide.md</w:t>
       </w:r>
-      <w:proofErr w:type="gramEnd"/>
-    </w:p>
-    <w:p>
-      <w:pPr>
-        <w:spacing w:after="0" w:line="240" w:lineRule="auto"/>
-      </w:pPr>
-      <w:proofErr w:type="gramStart"/>
+    </w:p>
+    <w:p>
+      <w:pPr>
+        <w:spacing w:after="0" w:line="240" w:lineRule="auto"/>
+      </w:pPr>
       <w:r>
         <w:t>docs/domain-model.md</w:t>
       </w:r>
-      <w:proofErr w:type="gramEnd"/>
-    </w:p>
-    <w:p>
-      <w:pPr>
-        <w:spacing w:after="0" w:line="240" w:lineRule="auto"/>
-      </w:pPr>
-      <w:proofErr w:type="gramStart"/>
+    </w:p>
+    <w:p>
+      <w:pPr>
+        <w:spacing w:after="0" w:line="240" w:lineRule="auto"/>
+      </w:pPr>
       <w:r>
         <w:t>docs/specification.md</w:t>
       </w:r>
-      <w:proofErr w:type="gramEnd"/>
-    </w:p>
-    <w:p>
-      <w:pPr>
-        <w:spacing w:after="0" w:line="240" w:lineRule="auto"/>
-      </w:pPr>
-      <w:proofErr w:type="gramStart"/>
+    </w:p>
+    <w:p>
+      <w:pPr>
+        <w:spacing w:after="0" w:line="240" w:lineRule="auto"/>
+      </w:pPr>
       <w:r>
         <w:t>docs/api-spec.md</w:t>
       </w:r>
-      <w:proofErr w:type="gramEnd"/>
-    </w:p>
-    <w:p>
-      <w:pPr>
-        <w:spacing w:after="0" w:line="240" w:lineRule="auto"/>
-      </w:pPr>
-      <w:proofErr w:type="gramStart"/>
+    </w:p>
+    <w:p>
+      <w:pPr>
+        <w:spacing w:after="0" w:line="240" w:lineRule="auto"/>
+      </w:pPr>
       <w:r>
         <w:t>docs/recommendation.md</w:t>
       </w:r>
-      <w:proofErr w:type="gramEnd"/>
     </w:p>
     <w:p>
       <w:pPr>
@@ -564,11 +483,9 @@
       <w:pPr>
         <w:spacing w:after="0" w:line="240" w:lineRule="auto"/>
       </w:pPr>
-      <w:proofErr w:type="gramStart"/>
       <w:r>
         <w:t>users</w:t>
       </w:r>
-      <w:proofErr w:type="gramEnd"/>
     </w:p>
     <w:p>
       <w:pPr>
@@ -623,28 +540,15 @@
         <w:spacing w:after="0" w:line="240" w:lineRule="auto"/>
       </w:pPr>
       <w:r>
-        <w:t xml:space="preserve">Tạo các cột đúng </w:t>
-      </w:r>
-      <w:proofErr w:type="gramStart"/>
-      <w:r>
-        <w:t>theo</w:t>
-      </w:r>
-      <w:proofErr w:type="gramEnd"/>
-      <w:r>
-        <w:t xml:space="preserve"> docs/database-guide.md:</w:t>
-      </w:r>
-    </w:p>
-    <w:p>
-      <w:pPr>
-        <w:spacing w:after="0" w:line="240" w:lineRule="auto"/>
-      </w:pPr>
-      <w:proofErr w:type="gramStart"/>
-      <w:r>
-        <w:t>users</w:t>
-      </w:r>
-      <w:proofErr w:type="gramEnd"/>
-      <w:r>
-        <w:t>: google_subject, email, display_name, avatar_url, status,</w:t>
+        <w:t>Tạo các cột đúng theo docs/database-guide.md:</w:t>
+      </w:r>
+    </w:p>
+    <w:p>
+      <w:pPr>
+        <w:spacing w:after="0" w:line="240" w:lineRule="auto"/>
+      </w:pPr>
+      <w:r>
+        <w:t>users: google_subject, email, display_name, avatar_url, status,</w:t>
       </w:r>
     </w:p>
     <w:p>
@@ -699,13 +603,8 @@
       <w:pPr>
         <w:spacing w:after="0" w:line="240" w:lineRule="auto"/>
       </w:pPr>
-      <w:proofErr w:type="gramStart"/>
-      <w:r>
-        <w:t>visibility</w:t>
-      </w:r>
-      <w:proofErr w:type="gramEnd"/>
-      <w:r>
-        <w:t>, visible_text, alt_text, position, created_at</w:t>
+      <w:r>
+        <w:t>visibility, visible_text, alt_text, position, created_at</w:t>
       </w:r>
     </w:p>
     <w:p>
@@ -720,13 +619,8 @@
       <w:pPr>
         <w:spacing w:after="0" w:line="240" w:lineRule="auto"/>
       </w:pPr>
-      <w:proofErr w:type="gramStart"/>
-      <w:r>
-        <w:t>google_subject</w:t>
-      </w:r>
-      <w:proofErr w:type="gramEnd"/>
-      <w:r>
-        <w:t xml:space="preserve"> là duy nhất.</w:t>
+      <w:r>
+        <w:t>google_subject là duy nhất.</w:t>
       </w:r>
     </w:p>
     <w:p>
@@ -749,52 +643,32 @@
       <w:pPr>
         <w:spacing w:after="0" w:line="240" w:lineRule="auto"/>
       </w:pPr>
-      <w:proofErr w:type="gramStart"/>
-      <w:r>
-        <w:t>limitations</w:t>
-      </w:r>
-      <w:proofErr w:type="gramEnd"/>
-      <w:r>
-        <w:t xml:space="preserve"> phải là JSON array.</w:t>
-      </w:r>
-    </w:p>
-    <w:p>
-      <w:pPr>
-        <w:spacing w:after="0" w:line="240" w:lineRule="auto"/>
-      </w:pPr>
-      <w:proofErr w:type="gramStart"/>
-      <w:r>
-        <w:t>position</w:t>
-      </w:r>
-      <w:proofErr w:type="gramEnd"/>
-      <w:r>
-        <w:t xml:space="preserve"> phải là JSON object hoặc NULL.</w:t>
-      </w:r>
-    </w:p>
-    <w:p>
-      <w:pPr>
-        <w:spacing w:after="0" w:line="240" w:lineRule="auto"/>
-      </w:pPr>
-      <w:proofErr w:type="gramStart"/>
-      <w:r>
-        <w:t>visibility</w:t>
-      </w:r>
-      <w:proofErr w:type="gramEnd"/>
-      <w:r>
-        <w:t xml:space="preserve"> chỉ nhận direct hoặc indirect.</w:t>
-      </w:r>
-    </w:p>
-    <w:p>
-      <w:pPr>
-        <w:spacing w:after="0" w:line="240" w:lineRule="auto"/>
-      </w:pPr>
-      <w:proofErr w:type="gramStart"/>
-      <w:r>
-        <w:t>actual_url</w:t>
-      </w:r>
-      <w:proofErr w:type="gramEnd"/>
-      <w:r>
-        <w:t xml:space="preserve"> chỉ là dữ liệu kết quả, không được dùng để tự động fetch.</w:t>
+      <w:r>
+        <w:t>limitations phải là JSON array.</w:t>
+      </w:r>
+    </w:p>
+    <w:p>
+      <w:pPr>
+        <w:spacing w:after="0" w:line="240" w:lineRule="auto"/>
+      </w:pPr>
+      <w:r>
+        <w:t>position phải là JSON object hoặc NULL.</w:t>
+      </w:r>
+    </w:p>
+    <w:p>
+      <w:pPr>
+        <w:spacing w:after="0" w:line="240" w:lineRule="auto"/>
+      </w:pPr>
+      <w:r>
+        <w:t>visibility chỉ nhận direct hoặc indirect.</w:t>
+      </w:r>
+    </w:p>
+    <w:p>
+      <w:pPr>
+        <w:spacing w:after="0" w:line="240" w:lineRule="auto"/>
+      </w:pPr>
+      <w:r>
+        <w:t>actual_url chỉ là dữ liệu kết quả, không được dùng để tự động fetch.</w:t>
       </w:r>
     </w:p>
     <w:p>
@@ -818,111 +692,55 @@
         <w:spacing w:after="0" w:line="240" w:lineRule="auto"/>
       </w:pPr>
       <w:r>
-        <w:t>link_</w:t>
-      </w:r>
-      <w:proofErr w:type="gramStart"/>
-      <w:r>
-        <w:t>checks(</w:t>
-      </w:r>
-      <w:proofErr w:type="gramEnd"/>
-      <w:r>
-        <w:t>user_id, created_at DESC)</w:t>
-      </w:r>
-    </w:p>
-    <w:p>
-      <w:pPr>
-        <w:spacing w:after="0" w:line="240" w:lineRule="auto"/>
-      </w:pPr>
-      <w:r>
-        <w:t>link_</w:t>
-      </w:r>
-      <w:proofErr w:type="gramStart"/>
-      <w:r>
-        <w:t>checks(</w:t>
-      </w:r>
-      <w:proofErr w:type="gramEnd"/>
-      <w:r>
-        <w:t>status, created_at DESC)</w:t>
-      </w:r>
-    </w:p>
-    <w:p>
-      <w:pPr>
-        <w:spacing w:after="0" w:line="240" w:lineRule="auto"/>
-      </w:pPr>
-      <w:r>
-        <w:t>link_</w:t>
-      </w:r>
-      <w:proofErr w:type="gramStart"/>
-      <w:r>
-        <w:t>checks(</w:t>
-      </w:r>
-      <w:proofErr w:type="gramEnd"/>
-      <w:r>
-        <w:t>retention_expires_at)</w:t>
-      </w:r>
-    </w:p>
-    <w:p>
-      <w:pPr>
-        <w:spacing w:after="0" w:line="240" w:lineRule="auto"/>
-      </w:pPr>
-      <w:r>
-        <w:t>link_</w:t>
-      </w:r>
-      <w:proofErr w:type="gramStart"/>
-      <w:r>
-        <w:t>results(</w:t>
-      </w:r>
-      <w:proofErr w:type="gramEnd"/>
-      <w:r>
-        <w:t>link_check_id, created_at)</w:t>
-      </w:r>
-    </w:p>
-    <w:p>
-      <w:pPr>
-        <w:spacing w:after="0" w:line="240" w:lineRule="auto"/>
-      </w:pPr>
-      <w:r>
-        <w:t>link_</w:t>
-      </w:r>
-      <w:proofErr w:type="gramStart"/>
-      <w:r>
-        <w:t>results(</w:t>
-      </w:r>
-      <w:proofErr w:type="gramEnd"/>
-      <w:r>
-        <w:t>visibility)</w:t>
-      </w:r>
-    </w:p>
-    <w:p>
-      <w:pPr>
-        <w:spacing w:after="0" w:line="240" w:lineRule="auto"/>
-      </w:pPr>
-      <w:r>
-        <w:t>link_</w:t>
-      </w:r>
-      <w:proofErr w:type="gramStart"/>
-      <w:r>
-        <w:t>results(</w:t>
-      </w:r>
-      <w:proofErr w:type="gramEnd"/>
-      <w:r>
-        <w:t>actual_url)</w:t>
-      </w:r>
-    </w:p>
-    <w:p>
-      <w:pPr>
-        <w:spacing w:after="0" w:line="240" w:lineRule="auto"/>
-      </w:pPr>
-      <w:r>
-        <w:t xml:space="preserve">Tạo trigger cập nhật updated_at cho </w:t>
-      </w:r>
-      <w:proofErr w:type="gramStart"/>
-      <w:r>
-        <w:t>users</w:t>
-      </w:r>
-      <w:proofErr w:type="gramEnd"/>
-      <w:r>
-        <w:t xml:space="preserve"> và link_checks.</w:t>
+        <w:t>link_checks(user_id, created_at DESC)</w:t>
+      </w:r>
+    </w:p>
+    <w:p>
+      <w:pPr>
+        <w:spacing w:after="0" w:line="240" w:lineRule="auto"/>
+      </w:pPr>
+      <w:r>
+        <w:t>link_checks(status, created_at DESC)</w:t>
+      </w:r>
+    </w:p>
+    <w:p>
+      <w:pPr>
+        <w:spacing w:after="0" w:line="240" w:lineRule="auto"/>
+      </w:pPr>
+      <w:r>
+        <w:t>link_checks(retention_expires_at)</w:t>
+      </w:r>
+    </w:p>
+    <w:p>
+      <w:pPr>
+        <w:spacing w:after="0" w:line="240" w:lineRule="auto"/>
+      </w:pPr>
+      <w:r>
+        <w:t>link_results(link_check_id, created_at)</w:t>
+      </w:r>
+    </w:p>
+    <w:p>
+      <w:pPr>
+        <w:spacing w:after="0" w:line="240" w:lineRule="auto"/>
+      </w:pPr>
+      <w:r>
+        <w:t>link_results(visibility)</w:t>
+      </w:r>
+    </w:p>
+    <w:p>
+      <w:pPr>
+        <w:spacing w:after="0" w:line="240" w:lineRule="auto"/>
+      </w:pPr>
+      <w:r>
+        <w:t>link_results(actual_url)</w:t>
+      </w:r>
+    </w:p>
+    <w:p>
+      <w:pPr>
+        <w:spacing w:after="0" w:line="240" w:lineRule="auto"/>
+      </w:pPr>
+      <w:r>
+        <w:t>Tạo trigger cập nhật updated_at cho users và link_checks.</w:t>
       </w:r>
     </w:p>
     <w:p>
@@ -939,15 +757,7 @@
         <w:spacing w:after="0" w:line="240" w:lineRule="auto"/>
       </w:pPr>
       <w:r>
-        <w:t xml:space="preserve">Tạo link check </w:t>
-      </w:r>
-      <w:proofErr w:type="gramStart"/>
-      <w:r>
-        <w:t>theo</w:t>
-      </w:r>
-      <w:proofErr w:type="gramEnd"/>
-      <w:r>
-        <w:t xml:space="preserve"> authenticated user.</w:t>
+        <w:t>Tạo link check theo authenticated user.</w:t>
       </w:r>
     </w:p>
     <w:p>
@@ -963,15 +773,7 @@
         <w:spacing w:after="0" w:line="240" w:lineRule="auto"/>
       </w:pPr>
       <w:r>
-        <w:t xml:space="preserve">Lấy chi tiết link check </w:t>
-      </w:r>
-      <w:proofErr w:type="gramStart"/>
-      <w:r>
-        <w:t>theo</w:t>
-      </w:r>
-      <w:proofErr w:type="gramEnd"/>
-      <w:r>
-        <w:t xml:space="preserve"> user ownership.</w:t>
+        <w:t>Lấy chi tiết link check theo user ownership.</w:t>
       </w:r>
     </w:p>
     <w:p>
@@ -987,47 +789,23 @@
         <w:spacing w:after="0" w:line="240" w:lineRule="auto"/>
       </w:pPr>
       <w:r>
-        <w:t xml:space="preserve">Lọc link result </w:t>
-      </w:r>
-      <w:proofErr w:type="gramStart"/>
-      <w:r>
-        <w:t>theo</w:t>
-      </w:r>
-      <w:proofErr w:type="gramEnd"/>
-      <w:r>
-        <w:t xml:space="preserve"> visibility.</w:t>
-      </w:r>
-    </w:p>
-    <w:p>
-      <w:pPr>
-        <w:spacing w:after="0" w:line="240" w:lineRule="auto"/>
-      </w:pPr>
-      <w:r>
-        <w:t xml:space="preserve">Cập nhật notes </w:t>
-      </w:r>
-      <w:proofErr w:type="gramStart"/>
-      <w:r>
-        <w:t>theo</w:t>
-      </w:r>
-      <w:proofErr w:type="gramEnd"/>
-      <w:r>
-        <w:t xml:space="preserve"> user ownership.</w:t>
-      </w:r>
-    </w:p>
-    <w:p>
-      <w:pPr>
-        <w:spacing w:after="0" w:line="240" w:lineRule="auto"/>
-      </w:pPr>
-      <w:r>
-        <w:t xml:space="preserve">Xóa link check </w:t>
-      </w:r>
-      <w:proofErr w:type="gramStart"/>
-      <w:r>
-        <w:t>theo</w:t>
-      </w:r>
-      <w:proofErr w:type="gramEnd"/>
-      <w:r>
-        <w:t xml:space="preserve"> user ownership.</w:t>
+        <w:t>Lọc link result theo visibility.</w:t>
+      </w:r>
+    </w:p>
+    <w:p>
+      <w:pPr>
+        <w:spacing w:after="0" w:line="240" w:lineRule="auto"/>
+      </w:pPr>
+      <w:r>
+        <w:t>Cập nhật notes theo user ownership.</w:t>
+      </w:r>
+    </w:p>
+    <w:p>
+      <w:pPr>
+        <w:spacing w:after="0" w:line="240" w:lineRule="auto"/>
+      </w:pPr>
+      <w:r>
+        <w:t>Xóa link check theo user ownership.</w:t>
       </w:r>
     </w:p>
     <w:p>
@@ -1043,15 +821,7 @@
         <w:spacing w:after="0" w:line="240" w:lineRule="auto"/>
       </w:pPr>
       <w:r>
-        <w:t xml:space="preserve">Nếu ứng dụng dùng server-side session, tạo </w:t>
-      </w:r>
-      <w:proofErr w:type="gramStart"/>
-      <w:r>
-        <w:t>thêm</w:t>
-      </w:r>
-      <w:proofErr w:type="gramEnd"/>
-      <w:r>
-        <w:t xml:space="preserve"> user_sessions với:</w:t>
+        <w:t>Nếu ứng dụng dùng server-side session, tạo thêm user_sessions với:</w:t>
       </w:r>
     </w:p>
     <w:p>
@@ -1312,30 +1082,14 @@
         <w:spacing w:after="0" w:line="240" w:lineRule="auto"/>
       </w:pPr>
       <w:r>
-        <w:t xml:space="preserve">Cách rollback </w:t>
-      </w:r>
-      <w:proofErr w:type="gramStart"/>
-      <w:r>
-        <w:t>an</w:t>
-      </w:r>
-      <w:proofErr w:type="gramEnd"/>
-      <w:r>
-        <w:t xml:space="preserve"> toàn nếu cần.</w:t>
+        <w:t>Cách rollback an toàn nếu cần.</w:t>
       </w:r>
       <w:r>
         <w:br/>
       </w:r>
       <w:r>
         <w:br/>
-        <w:t xml:space="preserve">Cập nhật rule tạo database vào docs/database-guide.md. Chuyển </w:t>
-      </w:r>
-      <w:proofErr w:type="gramStart"/>
-      <w:r>
-        <w:t>thư</w:t>
-      </w:r>
-      <w:proofErr w:type="gramEnd"/>
-      <w:r>
-        <w:t xml:space="preserve"> mục migrations vào git ignore.</w:t>
+        <w:t>Cập nhật rule tạo database vào docs/database-guide.md. Chuyển thư mục migrations vào git ignore.</w:t>
       </w:r>
       <w:r>
         <w:br/>
@@ -1407,13 +1161,8 @@
       <w:pPr>
         <w:spacing w:after="0" w:line="240" w:lineRule="auto"/>
       </w:pPr>
-      <w:proofErr w:type="gramStart"/>
-      <w:r>
-        <w:t>linking</w:t>
-      </w:r>
-      <w:proofErr w:type="gramEnd"/>
-      <w:r>
-        <w:t xml:space="preserve"> hoặc authorization.</w:t>
+      <w:r>
+        <w:t>linking hoặc authorization.</w:t>
       </w:r>
     </w:p>
     <w:p>
@@ -1428,63 +1177,36 @@
       <w:pPr>
         <w:spacing w:after="0" w:line="240" w:lineRule="auto"/>
       </w:pPr>
-      <w:proofErr w:type="gramStart"/>
-      <w:r>
-        <w:t>triển</w:t>
-      </w:r>
-      <w:proofErr w:type="gramEnd"/>
-      <w:r>
-        <w:t xml:space="preserve"> khai OAuth callback, tạo / liên kết user an toàn, session lifecycle,</w:t>
-      </w:r>
-    </w:p>
-    <w:p>
-      <w:pPr>
-        <w:spacing w:after="0" w:line="240" w:lineRule="auto"/>
-      </w:pPr>
-      <w:proofErr w:type="gramStart"/>
-      <w:r>
-        <w:t>authorization</w:t>
-      </w:r>
-      <w:proofErr w:type="gramEnd"/>
-      <w:r>
-        <w:t xml:space="preserve"> và ownership checks. </w:t>
+      <w:r>
+        <w:t>triển khai OAuth callback, tạo / liên kết user an toàn, session lifecycle,</w:t>
+      </w:r>
+    </w:p>
+    <w:p>
+      <w:pPr>
+        <w:spacing w:after="0" w:line="240" w:lineRule="auto"/>
+      </w:pPr>
+      <w:r>
+        <w:t xml:space="preserve">authorization và ownership checks. </w:t>
       </w:r>
       <w:r>
         <w:br/>
-      </w:r>
-      <w:proofErr w:type="gramStart"/>
-      <w:r>
-        <w:t>Thêm</w:t>
-      </w:r>
-      <w:proofErr w:type="gramEnd"/>
-      <w:r>
-        <w:t xml:space="preserve"> test cho state mismatch, callback lỗi,</w:t>
-      </w:r>
-    </w:p>
-    <w:p>
-      <w:pPr>
-        <w:spacing w:after="0" w:line="240" w:lineRule="auto"/>
-      </w:pPr>
-      <w:proofErr w:type="gramStart"/>
-      <w:r>
-        <w:t>account</w:t>
-      </w:r>
-      <w:proofErr w:type="gramEnd"/>
-      <w:r>
-        <w:t xml:space="preserve"> conflict, session expiry và truy cập dữ liệu user khác. Không ghi</w:t>
-      </w:r>
-    </w:p>
-    <w:p>
-      <w:pPr>
-        <w:spacing w:after="0" w:line="240" w:lineRule="auto"/>
-      </w:pPr>
-      <w:proofErr w:type="gramStart"/>
-      <w:r>
-        <w:t>token</w:t>
-      </w:r>
-      <w:proofErr w:type="gramEnd"/>
-      <w:r>
-        <w:t>, authorization code hoặc secret vào log.</w:t>
+        <w:t>Thêm test cho state mismatch, callback lỗi,</w:t>
+      </w:r>
+    </w:p>
+    <w:p>
+      <w:pPr>
+        <w:spacing w:after="0" w:line="240" w:lineRule="auto"/>
+      </w:pPr>
+      <w:r>
+        <w:t>account conflict, session expiry và truy cập dữ liệu user khác. Không ghi</w:t>
+      </w:r>
+    </w:p>
+    <w:p>
+      <w:pPr>
+        <w:spacing w:after="0" w:line="240" w:lineRule="auto"/>
+      </w:pPr>
+      <w:r>
+        <w:t>token, authorization code hoặc secret vào log.</w:t>
       </w:r>
     </w:p>
     <w:p>
@@ -1525,13 +1247,8 @@
       <w:pPr>
         <w:spacing w:after="0" w:line="240" w:lineRule="auto"/>
       </w:pPr>
-      <w:proofErr w:type="gramStart"/>
-      <w:r>
-        <w:t>đã</w:t>
-      </w:r>
-      <w:proofErr w:type="gramEnd"/>
-      <w:r>
-        <w:t xml:space="preserve"> duyệt.</w:t>
+      <w:r>
+        <w:t>đã duyệt.</w:t>
       </w:r>
     </w:p>
     <w:p>
@@ -1579,15 +1296,7 @@
         <w:spacing w:after="0" w:line="240" w:lineRule="auto"/>
       </w:pPr>
       <w:r>
-        <w:t xml:space="preserve">   </w:t>
-      </w:r>
-      <w:proofErr w:type="gramStart"/>
-      <w:r>
-        <w:t>counts</w:t>
-      </w:r>
-      <w:proofErr w:type="gramEnd"/>
-      <w:r>
-        <w:t xml:space="preserve"> và limitation.</w:t>
+        <w:t xml:space="preserve">   counts và limitation.</w:t>
       </w:r>
     </w:p>
     <w:p>
@@ -1618,13 +1327,8 @@
       <w:pPr>
         <w:spacing w:after="0" w:line="240" w:lineRule="auto"/>
       </w:pPr>
-      <w:proofErr w:type="gramStart"/>
-      <w:r>
-        <w:t>bypass</w:t>
-      </w:r>
-      <w:proofErr w:type="gramEnd"/>
-      <w:r>
-        <w:t xml:space="preserve"> hoặc tự động đăng nhập vào website đích.</w:t>
+      <w:r>
+        <w:t>bypass hoặc tự động đăng nhập vào website đích.</w:t>
       </w:r>
     </w:p>
     <w:p>
@@ -1639,13 +1343,8 @@
       <w:pPr>
         <w:spacing w:after="0" w:line="240" w:lineRule="auto"/>
       </w:pPr>
-      <w:proofErr w:type="gramStart"/>
-      <w:r>
-        <w:t>ranh</w:t>
-      </w:r>
-      <w:proofErr w:type="gramEnd"/>
-      <w:r>
-        <w:t xml:space="preserve"> giới bảo mật. Trước khi triển khai, báo cáo các file cần thay đổi.</w:t>
+      <w:r>
+        <w:t>ranh giới bảo mật. Trước khi triển khai, báo cáo các file cần thay đổi.</w:t>
       </w:r>
       <w:r>
         <w:br/>
@@ -1677,13 +1376,8 @@
       <w:pPr>
         <w:spacing w:after="0" w:line="240" w:lineRule="auto"/>
       </w:pPr>
-      <w:proofErr w:type="gramStart"/>
-      <w:r>
-        <w:t>tài</w:t>
-      </w:r>
-      <w:proofErr w:type="gramEnd"/>
-      <w:r>
-        <w:t xml:space="preserve"> liệu nào trong repository không. Nếu không có, không gắn nó vào Hidden</w:t>
+      <w:r>
+        <w:t>tài liệu nào trong repository không. Nếu không có, không gắn nó vào Hidden</w:t>
       </w:r>
     </w:p>
     <w:p>
@@ -1707,63 +1401,31 @@
         <w:spacing w:after="0" w:line="240" w:lineRule="auto"/>
       </w:pPr>
       <w:r>
-        <w:t xml:space="preserve">- </w:t>
-      </w:r>
-      <w:proofErr w:type="gramStart"/>
-      <w:r>
-        <w:t>đây</w:t>
-      </w:r>
-      <w:proofErr w:type="gramEnd"/>
-      <w:r>
-        <w:t xml:space="preserve"> là sản phẩm/module riêng hay tính năng mới của Hidden Link Checker;</w:t>
-      </w:r>
-    </w:p>
-    <w:p>
-      <w:pPr>
-        <w:spacing w:after="0" w:line="240" w:lineRule="auto"/>
-      </w:pPr>
-      <w:r>
-        <w:t xml:space="preserve">- </w:t>
-      </w:r>
-      <w:proofErr w:type="gramStart"/>
-      <w:r>
-        <w:t>quốc</w:t>
-      </w:r>
-      <w:proofErr w:type="gramEnd"/>
-      <w:r>
-        <w:t xml:space="preserve"> gia và loại thuế;</w:t>
-      </w:r>
-    </w:p>
-    <w:p>
-      <w:pPr>
-        <w:spacing w:after="0" w:line="240" w:lineRule="auto"/>
-      </w:pPr>
-      <w:r>
-        <w:t xml:space="preserve">- </w:t>
-      </w:r>
-      <w:proofErr w:type="gramStart"/>
-      <w:r>
-        <w:t>loại</w:t>
-      </w:r>
-      <w:proofErr w:type="gramEnd"/>
-      <w:r>
-        <w:t xml:space="preserve"> giao dịch, đầu vào/đầu ra, làm tròn và thời điểm áp dụng;</w:t>
-      </w:r>
-    </w:p>
-    <w:p>
-      <w:pPr>
-        <w:spacing w:after="0" w:line="240" w:lineRule="auto"/>
-      </w:pPr>
-      <w:r>
-        <w:t xml:space="preserve">- </w:t>
-      </w:r>
-      <w:proofErr w:type="gramStart"/>
-      <w:r>
-        <w:t>nguồn</w:t>
-      </w:r>
-      <w:proofErr w:type="gramEnd"/>
-      <w:r>
-        <w:t xml:space="preserve"> dữ liệu và yêu cầu pháp lý;</w:t>
+        <w:t>- đây là sản phẩm/module riêng hay tính năng mới của Hidden Link Checker;</w:t>
+      </w:r>
+    </w:p>
+    <w:p>
+      <w:pPr>
+        <w:spacing w:after="0" w:line="240" w:lineRule="auto"/>
+      </w:pPr>
+      <w:r>
+        <w:t>- quốc gia và loại thuế;</w:t>
+      </w:r>
+    </w:p>
+    <w:p>
+      <w:pPr>
+        <w:spacing w:after="0" w:line="240" w:lineRule="auto"/>
+      </w:pPr>
+      <w:r>
+        <w:t>- loại giao dịch, đầu vào/đầu ra, làm tròn và thời điểm áp dụng;</w:t>
+      </w:r>
+    </w:p>
+    <w:p>
+      <w:pPr>
+        <w:spacing w:after="0" w:line="240" w:lineRule="auto"/>
+      </w:pPr>
+      <w:r>
+        <w:t>- nguồn dữ liệu và yêu cầu pháp lý;</w:t>
       </w:r>
     </w:p>
     <w:p>
@@ -1786,26 +1448,16 @@
       <w:pPr>
         <w:spacing w:after="0" w:line="240" w:lineRule="auto"/>
       </w:pPr>
-      <w:proofErr w:type="gramStart"/>
-      <w:r>
-        <w:t>triển</w:t>
-      </w:r>
-      <w:proofErr w:type="gramEnd"/>
-      <w:r>
-        <w:t xml:space="preserve"> khai. Không tự đưa ra kết luận thuế pháp lý hoặc tự đặt công thức khi</w:t>
-      </w:r>
-    </w:p>
-    <w:p>
-      <w:pPr>
-        <w:spacing w:after="0" w:line="240" w:lineRule="auto"/>
-      </w:pPr>
-      <w:proofErr w:type="gramStart"/>
-      <w:r>
-        <w:t>thiếu</w:t>
-      </w:r>
-      <w:proofErr w:type="gramEnd"/>
-      <w:r>
-        <w:t xml:space="preserve"> quy tắc nghiệp vụ.</w:t>
+      <w:r>
+        <w:t>triển khai. Không tự đưa ra kết luận thuế pháp lý hoặc tự đặt công thức khi</w:t>
+      </w:r>
+    </w:p>
+    <w:p>
+      <w:pPr>
+        <w:spacing w:after="0" w:line="240" w:lineRule="auto"/>
+      </w:pPr>
+      <w:r>
+        <w:t>thiếu quy tắc nghiệp vụ.</w:t>
       </w:r>
       <w:r>
         <w:br/>
@@ -1827,15 +1479,7 @@
       </w:r>
       <w:r>
         <w:lastRenderedPageBreak/>
-        <w:t xml:space="preserve">Tại repo HiddenLinkChecker: Bạn hãy ghi phần hướng dẫn chạy test </w:t>
-      </w:r>
-      <w:proofErr w:type="gramStart"/>
-      <w:r>
-        <w:t>thư</w:t>
-      </w:r>
-      <w:proofErr w:type="gramEnd"/>
-      <w:r>
-        <w:t xml:space="preserve"> viện tax_calculation và 1 mục riêng trong README</w:t>
+        <w:t>Tại repo HiddenLinkChecker: Bạn hãy ghi phần hướng dẫn chạy test thư viện tax_calculation và 1 mục riêng trong README</w:t>
       </w:r>
     </w:p>
     <w:p>
@@ -1862,39 +1506,15 @@
       </w:r>
       <w:r>
         <w:br/>
-        <w:t xml:space="preserve">Tôi có 1 code </w:t>
-      </w:r>
-      <w:proofErr w:type="gramStart"/>
-      <w:r>
-        <w:t>thư</w:t>
-      </w:r>
-      <w:proofErr w:type="gramEnd"/>
-      <w:r>
-        <w:t xml:space="preserve"> viện TaxCalculationLibrary. Tôi cần build </w:t>
-      </w:r>
-      <w:proofErr w:type="gramStart"/>
-      <w:r>
-        <w:t>thư</w:t>
-      </w:r>
-      <w:proofErr w:type="gramEnd"/>
-      <w:r>
-        <w:t xml:space="preserve"> viện theo hướng dẫn ở README.md của project này.</w:t>
-      </w:r>
-    </w:p>
-    <w:p>
-      <w:pPr>
-        <w:spacing w:after="0" w:line="240" w:lineRule="auto"/>
-      </w:pPr>
-      <w:r>
-        <w:t xml:space="preserve">Tại Project HIddenLinkChecker, tạo 1 module riêng cho phép gọi </w:t>
-      </w:r>
-      <w:proofErr w:type="gramStart"/>
-      <w:r>
-        <w:t>thư</w:t>
-      </w:r>
-      <w:proofErr w:type="gramEnd"/>
-      <w:r>
-        <w:t xml:space="preserve"> viện đó.</w:t>
+        <w:t>Tôi có 1 code thư viện TaxCalculationLibrary. Tôi cần build thư viện theo hướng dẫn ở README.md của project này.</w:t>
+      </w:r>
+    </w:p>
+    <w:p>
+      <w:pPr>
+        <w:spacing w:after="0" w:line="240" w:lineRule="auto"/>
+      </w:pPr>
+      <w:r>
+        <w:t>Tại Project HIddenLinkChecker, tạo 1 module riêng cho phép gọi thư viện đó.</w:t>
       </w:r>
     </w:p>
     <w:p>
@@ -1937,15 +1557,7 @@
         <w:spacing w:after="0" w:line="240" w:lineRule="auto"/>
       </w:pPr>
       <w:r>
-        <w:t xml:space="preserve">Xuất cả input và output tương ứng trong </w:t>
-      </w:r>
-      <w:proofErr w:type="gramStart"/>
-      <w:r>
-        <w:t>thư</w:t>
-      </w:r>
-      <w:proofErr w:type="gramEnd"/>
-      <w:r>
-        <w:t xml:space="preserve"> mục examples</w:t>
+        <w:t>Xuất cả input và output tương ứng trong thư mục examples</w:t>
       </w:r>
     </w:p>
     <w:p>
@@ -1979,15 +1591,7 @@
         <w:br/>
       </w:r>
       <w:r>
-        <w:t xml:space="preserve">Hoàn thiện các phần còn thiếu của dự </w:t>
-      </w:r>
-      <w:proofErr w:type="gramStart"/>
-      <w:r>
-        <w:t>án</w:t>
-      </w:r>
-      <w:proofErr w:type="gramEnd"/>
-      <w:r>
-        <w:t xml:space="preserve"> để đạt 100% như mô tả của recommendation, spec. Tuân thủ coding-rule</w:t>
+        <w:t>Hoàn thiện các phần còn thiếu của dự án để đạt 100% như mô tả của recommendation, spec. Tuân thủ coding-rule</w:t>
       </w:r>
       <w:r>
         <w:t xml:space="preserve"> và các tài liệu trong docs/</w:t>
@@ -2117,8 +1721,6 @@
       </w:r>
       <w:r>
         <w:br/>
-      </w:r>
-      <w:r>
         <w:t xml:space="preserve">Dựa trên </w:t>
       </w:r>
       <w:r>
@@ -2153,15 +1755,7 @@
       </w:r>
       <w:r>
         <w:lastRenderedPageBreak/>
-        <w:t xml:space="preserve">xuất link, trả kết quả cùng response và sau khi xử lý chỉ lưu lịch sử URL tối giản. Hidden link, DOM và trạng thái xử lý không được lưu lâu dài. Loại bỏ các đường đi queue/detail/history status chỉ khi không còn cần </w:t>
-      </w:r>
-      <w:proofErr w:type="gramStart"/>
-      <w:r>
-        <w:t>theo</w:t>
-      </w:r>
-      <w:proofErr w:type="gramEnd"/>
-      <w:r>
-        <w:t xml:space="preserve"> contract mới. Cập nhật shared API models, service, controller, web API client, dashboard và tài liệu để thống nhất. Đảm bảo hidden link không bao giờ được request hoặc điều hướng tới. Thêm kiểm thử unit và integration cho luồng thành công, lỗi và privacy.</w:t>
+        <w:t>xuất link, trả kết quả cùng response và sau khi xử lý chỉ lưu lịch sử URL tối giản. Hidden link, DOM và trạng thái xử lý không được lưu lâu dài. Loại bỏ các đường đi queue/detail/history status chỉ khi không còn cần theo contract mới. Cập nhật shared API models, service, controller, web API client, dashboard và tài liệu để thống nhất. Đảm bảo hidden link không bao giờ được request hoặc điều hướng tới. Thêm kiểm thử unit và integration cho luồng thành công, lỗi và privacy.</w:t>
       </w:r>
       <w:r>
         <w:br/>
@@ -2180,15 +1774,8 @@
       </w:r>
       <w:r>
         <w:br/>
-      </w:r>
-      <w:r>
-        <w:t>Hãy xử lý các giới hạn còn lại</w:t>
-      </w:r>
-      <w:r>
-        <w:t>:</w:t>
-      </w:r>
-      <w:bookmarkStart w:id="0" w:name="_GoBack"/>
-      <w:bookmarkEnd w:id="0"/>
+        <w:t>Hãy xử lý các giới hạn còn lại:</w:t>
+      </w:r>
       <w:r>
         <w:rPr>
           <w:rStyle w:val="Strong"/>
@@ -2208,14 +1795,264 @@
       <w:r>
         <w:t>. Test dùng mock HTTP và in-memory history, chưa chạy với PostgreSQL thật.</w:t>
       </w:r>
-    </w:p>
-    <w:p>
-      <w:pPr>
-        <w:spacing w:after="0" w:line="240" w:lineRule="auto"/>
-      </w:pPr>
       <w:r>
         <w:br/>
       </w:r>
+      <w:r>
+        <w:br/>
+      </w:r>
+      <w:r>
+        <w:rPr>
+          <w:rStyle w:val="Heading1Char"/>
+        </w:rPr>
+        <w:t>Prompt 16</w:t>
+      </w:r>
+    </w:p>
+    <w:p>
+      <w:pPr>
+        <w:rPr>
+          <w:rStyle w:val="Heading1Char"/>
+        </w:rPr>
+      </w:pPr>
+      <w:r>
+        <w:br/>
+      </w:r>
+      <w:r>
+        <w:t xml:space="preserve">Xây dựng thành phần fetch URL đầu vào có giới hạn và tích hợp </w:t>
+      </w:r>
+      <w:r>
+        <w:rPr>
+          <w:rStyle w:val="HTMLCode"/>
+          <w:rFonts w:eastAsiaTheme="minorEastAsia"/>
+        </w:rPr>
+        <w:t>ensure_safe_navigation_url</w:t>
+      </w:r>
+      <w:r>
+        <w:t xml:space="preserve"> vào luồng kiểm tra đồng bộ. Chỉ cho phép HTTP/HTTPS; kiểm tra DNS/IP trước kết nối và sau từng redirect; chặn địa chỉ private, loopback, link-local, multicast, reserved và metadata. Giới hạn thời gian, redirect, kích thước response và concurrency; không chuyển cookie, authorization header hoặc application secret tới host đích. Xử lý DNS rebinding bằng cách bảo đảm IP được xác minh là IP dùng để kết nối. Trả lỗi có kiểm soát theo </w:t>
+      </w:r>
+      <w:r>
+        <w:rPr>
+          <w:rStyle w:val="HTMLCode"/>
+          <w:rFonts w:eastAsiaTheme="minorEastAsia"/>
+        </w:rPr>
+        <w:t>failed</w:t>
+      </w:r>
+      <w:r>
+        <w:t xml:space="preserve"> hoặc </w:t>
+      </w:r>
+      <w:r>
+        <w:rPr>
+          <w:rStyle w:val="HTMLCode"/>
+          <w:rFonts w:eastAsiaTheme="minorEastAsia"/>
+        </w:rPr>
+        <w:t>partial</w:t>
+      </w:r>
+      <w:r>
+        <w:t>. Không truy cập bất kỳ URL phát hiện nào trong DOM. Thêm kiểm thử cho redirect tới IP nội bộ, timeout, response quá lớn và lỗi mạng.</w:t>
+      </w:r>
+      <w:r>
+        <w:br/>
+      </w:r>
+      <w:r>
+        <w:br/>
+      </w:r>
+      <w:r>
+        <w:rPr>
+          <w:rStyle w:val="Heading1Char"/>
+        </w:rPr>
+        <w:t>Prompt 17</w:t>
+      </w:r>
+    </w:p>
+    <w:p>
+      <w:pPr>
+        <w:rPr>
+          <w:rStyle w:val="Heading1Char"/>
+        </w:rPr>
+      </w:pPr>
+      <w:r>
+        <w:t xml:space="preserve">Triển khai </w:t>
+      </w:r>
+      <w:r>
+        <w:rPr>
+          <w:rStyle w:val="HTMLCode"/>
+          <w:rFonts w:eastAsiaTheme="minorEastAsia"/>
+        </w:rPr>
+        <w:t>UrlCheckRepository</w:t>
+      </w:r>
+      <w:r>
+        <w:t xml:space="preserve"> PostgreSQL dùng bảng </w:t>
+      </w:r>
+      <w:r>
+        <w:rPr>
+          <w:rStyle w:val="HTMLCode"/>
+          <w:rFonts w:eastAsiaTheme="minorEastAsia"/>
+        </w:rPr>
+        <w:t>url_checks</w:t>
+      </w:r>
+      <w:r>
+        <w:t xml:space="preserve"> để ghi và đọc lịch sử (</w:t>
+      </w:r>
+      <w:r>
+        <w:rPr>
+          <w:rStyle w:val="HTMLCode"/>
+          <w:rFonts w:eastAsiaTheme="minorEastAsia"/>
+        </w:rPr>
+        <w:t>url</w:t>
+      </w:r>
+      <w:r>
+        <w:t xml:space="preserve">, </w:t>
+      </w:r>
+      <w:r>
+        <w:rPr>
+          <w:rStyle w:val="HTMLCode"/>
+          <w:rFonts w:eastAsiaTheme="minorEastAsia"/>
+        </w:rPr>
+        <w:t>checked_at</w:t>
+      </w:r>
+      <w:r>
+        <w:t xml:space="preserve">) theo authenticated </w:t>
+      </w:r>
+      <w:r>
+        <w:rPr>
+          <w:rStyle w:val="HTMLCode"/>
+          <w:rFonts w:eastAsiaTheme="minorEastAsia"/>
+        </w:rPr>
+        <w:t>user_id</w:t>
+      </w:r>
+      <w:r>
+        <w:t xml:space="preserve">. Dùng parameterized query, transaction phù hợp, index truy vấn theo user và thao tác xóa có điều kiện ownership. Thay repository in-memory khỏi cấu hình mặc định production; chỉ giữ adapter in-memory cho test/dev. Kiểm tra chuỗi migration có tạo đầy đủ schema </w:t>
+      </w:r>
+      <w:r>
+        <w:rPr>
+          <w:rStyle w:val="HTMLCode"/>
+          <w:rFonts w:eastAsiaTheme="minorEastAsia"/>
+        </w:rPr>
+        <w:t>users</w:t>
+      </w:r>
+      <w:r>
+        <w:t xml:space="preserve"> trước các migration auth/history, và bổ sung migration khởi tạo nếu đang thiếu. Không lưu DOM hoặc link result. Thêm kiểm thử repository và API ownership.</w:t>
+      </w:r>
+      <w:r>
+        <w:rPr>
+          <w:rStyle w:val="Heading1Char"/>
+        </w:rPr>
+        <w:br/>
+      </w:r>
+    </w:p>
+    <w:p>
+      <w:pPr>
+        <w:rPr>
+          <w:rStyle w:val="Heading1Char"/>
+        </w:rPr>
+      </w:pPr>
+      <w:r>
+        <w:rPr>
+          <w:rStyle w:val="Heading1Char"/>
+        </w:rPr>
+        <w:t>Prompt 18</w:t>
+      </w:r>
+    </w:p>
+    <w:p>
+      <w:pPr>
+        <w:rPr>
+          <w:rStyle w:val="Heading1Char"/>
+        </w:rPr>
+      </w:pPr>
+      <w:r>
+        <w:t xml:space="preserve">Cập nhật dashboard để gửi URL tới API đồng bộ và hiển thị kết quả ngay sau response: URL đầu vào, trạng thái, limitations, danh sách link, element type, visibility, object reference, source URL, actual URL và các trường DOM được phép hiển thị. Thêm bộ lọc theo visibility và element type trên kết quả của lần gọi hiện tại. Hiển thị lỗi </w:t>
+      </w:r>
+      <w:r>
+        <w:rPr>
+          <w:rStyle w:val="HTMLCode"/>
+          <w:rFonts w:eastAsiaTheme="minorEastAsia"/>
+        </w:rPr>
+        <w:t>partial</w:t>
+      </w:r>
+      <w:r>
+        <w:t>/</w:t>
+      </w:r>
+      <w:r>
+        <w:rPr>
+          <w:rStyle w:val="HTMLCode"/>
+          <w:rFonts w:eastAsiaTheme="minorEastAsia"/>
+        </w:rPr>
+        <w:t>failed</w:t>
+      </w:r>
+      <w:r>
+        <w:t xml:space="preserve"> rõ ràng. Giữ mọi thao tác dữ liệu qua API; không để frontend truy cập database. Thêm kiểm thử rendering và API client.</w:t>
+      </w:r>
+      <w:r>
+        <w:br/>
+      </w:r>
+      <w:r>
+        <w:lastRenderedPageBreak/>
+        <w:br/>
+      </w:r>
+      <w:r>
+        <w:rPr>
+          <w:rStyle w:val="Heading1Char"/>
+        </w:rPr>
+        <w:t>Prompt 19</w:t>
+      </w:r>
+    </w:p>
+    <w:p>
+      <w:pPr>
+        <w:rPr>
+          <w:rStyle w:val="Heading1Char"/>
+        </w:rPr>
+      </w:pPr>
+      <w:r>
+        <w:t xml:space="preserve">Rà soát luồng kiểm tra để các lỗi validation, DNS, TLS, HTTP 403/429, timeout, lỗi worker/parser và giới hạn tài nguyên đều trả response có kiểm soát, không làm API crash và không lộ secret. Ánh xạ kết quả phù hợp sang </w:t>
+      </w:r>
+      <w:r>
+        <w:rPr>
+          <w:rStyle w:val="HTMLCode"/>
+          <w:rFonts w:eastAsiaTheme="minorEastAsia"/>
+        </w:rPr>
+        <w:t>completed</w:t>
+      </w:r>
+      <w:r>
+        <w:t xml:space="preserve">, </w:t>
+      </w:r>
+      <w:r>
+        <w:rPr>
+          <w:rStyle w:val="HTMLCode"/>
+          <w:rFonts w:eastAsiaTheme="minorEastAsia"/>
+        </w:rPr>
+        <w:t>partial</w:t>
+      </w:r>
+      <w:r>
+        <w:t xml:space="preserve"> hoặc </w:t>
+      </w:r>
+      <w:r>
+        <w:rPr>
+          <w:rStyle w:val="HTMLCode"/>
+          <w:rFonts w:eastAsiaTheme="minorEastAsia"/>
+        </w:rPr>
+        <w:t>failed</w:t>
+      </w:r>
+      <w:r>
+        <w:t>; ghi limitations đủ để dashboard giải thích phần không đọc được. Đảm bảo kể cả scan lỗi cũng chỉ lưu lịch sử URL theo policy đã thống nhất, không lưu kết quả scan. Thêm test cho từng nhóm lỗi quan trọng.</w:t>
+      </w:r>
+      <w:r>
+        <w:br/>
+      </w:r>
+      <w:r>
+        <w:br/>
+      </w:r>
+      <w:r>
+        <w:rPr>
+          <w:rStyle w:val="Heading1Char"/>
+        </w:rPr>
+        <w:t>Prompt 20</w:t>
+      </w:r>
+    </w:p>
+    <w:p>
+      <w:r>
+        <w:t>Đối chiếu README, API spec, database guide, domain model, coding rules và migration với recommendation/spec hiện tại. Loại bỏ mô tả không còn đúng về queue, xử lý bất đồng bộ, lưu link result và trạng thái cũ; mô tả contract đồng bộ, dữ liệu lịch sử tối giản, giới hạn SSRF và cách cấu hình production. Lập bảng truy vết FR-001 đến FR-008 và AC-01 đến AC-06 tới module và test tương ứng; đánh dấu rõ mục nào đã đáp ứng, còn thiếu hoặc chưa được xác minh. Không tuyên bố tiêu chí đã đạt nếu chưa có bằng chứng.</w:t>
+      </w:r>
+      <w:bookmarkStart w:id="0" w:name="_GoBack"/>
+      <w:bookmarkEnd w:id="0"/>
     </w:p>
     <w:sectPr>
       <w:pgSz w:w="12240" w:h="15840"/>
@@ -14192,7 +14029,7 @@
 </file>
 
 <file path=customXml/itemProps1.xml><?xml version="1.0" encoding="utf-8"?>
-<ds:datastoreItem xmlns:ds="http://schemas.openxmlformats.org/officeDocument/2006/customXml" ds:itemID="{7AEFA2AC-3B6A-4AD1-BC06-1C92098AE99D}">
+<ds:datastoreItem xmlns:ds="http://schemas.openxmlformats.org/officeDocument/2006/customXml" ds:itemID="{3E075C13-5BF1-4674-AE00-B767E6650317}">
   <ds:schemaRefs>
     <ds:schemaRef ds:uri="http://schemas.openxmlformats.org/officeDocument/2006/bibliography"/>
   </ds:schemaRefs>

</xml_diff>